<commit_message>
Propaga la URL pública del Streamlit a artículos y README
La aplicación quedó desplegada en
https://gestionruta-fvzdvkcjthzfavm9fcmk9c.streamlit.app/
y se reemplaza el placeholder "URL pública pendiente al desplegar" por el
link real en los tres archivos del artículo (HTML LinkedIn, DOCX, HTML web)
y en el README. El DOCX se regenera con el script para mantener la
consistencia con la plantilla.
</commit_message>
<xml_diff>
--- a/docs/articulo_linkedin.docx
+++ b/docs/articulo_linkedin.docx
@@ -264,7 +264,7 @@
           <w:color w:val="2D3748"/>
           <w:sz w:val="22"/>
         </w:rPr>
-        <w:t>⭐ Repositorio en GitHub (código abierto, MIT): github.com/leanmasterpymes/gestion_rutas. Clónalo y ejecuta el sistema completo en tu computadora.</w:t>
+        <w:t>⭐ Repositorio en GitHub (código abierto, MIT): github.com/leanmasterpymes/gestion_ruta. Clónalo y ejecuta el sistema completo en tu computadora.</w:t>
       </w:r>
     </w:p>
     <w:p>
@@ -277,7 +277,7 @@
           <w:color w:val="2D3748"/>
           <w:sz w:val="22"/>
         </w:rPr>
-        <w:t>Notebook en Google Colab: colab.research.google.com/github/leanmasterpymes/gestion_rutas/blob/main/notebooks/01_ruteo_multinivel.ipynb. El flujo completo paso a paso, sin instalar nada.</w:t>
+        <w:t>Notebook en Google Colab: colab.research.google.com/github/leanmasterpymes/gestion_ruta/blob/main/notebooks/01_ruteo_multinivel.ipynb. El flujo completo paso a paso, sin instalar nada.</w:t>
       </w:r>
     </w:p>
     <w:p>
@@ -290,7 +290,7 @@
           <w:color w:val="2D3748"/>
           <w:sz w:val="22"/>
         </w:rPr>
-        <w:t>Planificador interactivo: sube un archivo de clientes y obtén el plan diario coordinado entre centros. URL pública pendiente al desplegar.</w:t>
+        <w:t>👉 Planificador interactivo en Streamlit (sin instalación): https://gestionruta-fvzdvkcjthzfavm9fcmk9c.streamlit.app/. Plan diario con mapa interactivo, métricas del modelo de demanda, comparativa antes/después y descarga del plan en CSV.</w:t>
       </w:r>
     </w:p>
     <w:p>
@@ -409,7 +409,7 @@
           <w:color w:val="1A2233"/>
           <w:sz w:val="22"/>
         </w:rPr>
-        <w:t>Para responder a esta situación desarrollé un sistema de código abierto, disponible en GitHub: github.com/leanmasterpymes/gestion_rutas, que aborda el problema desde la predicción de demanda hasta el plan diario coordinado entre los centros de distribución.</w:t>
+        <w:t>Para responder a esta situación desarrollé un sistema de código abierto, disponible en GitHub: github.com/leanmasterpymes/gestion_ruta, que aborda el problema desde la predicción de demanda hasta el plan diario coordinado entre los centros de distribución.</w:t>
       </w:r>
     </w:p>
     <w:p>
@@ -1145,7 +1145,7 @@
           <w:color w:val="2D3748"/>
           <w:sz w:val="22"/>
         </w:rPr>
-        <w:t>🔗 El código completo está publicado bajo licencia MIT en github.com/leanmasterpymes/gestion_rutas. Cualquiera puede clonarlo, correr el sistema en su computadora y conectar sus propios datos de clientes. El planificador abre en el navegador y permite cargar un archivo de clientes propio para generar un plan personalizado.</w:t>
+        <w:t>🔗 El código completo está publicado bajo licencia MIT en github.com/leanmasterpymes/gestion_ruta. Cualquiera puede clonarlo, correr el sistema en su computadora y conectar sus propios datos de clientes. El planificador abre en el navegador y permite cargar un archivo de clientes propio para generar un plan personalizado.</w:t>
       </w:r>
     </w:p>
     <w:p>
@@ -1259,7 +1259,7 @@
           <w:color w:val="1A4373"/>
           <w:sz w:val="23"/>
         </w:rPr>
-        <w:t>👉 Abrir el repositorio en GitHub: github.com/leanmasterpymes/gestion_rutas</w:t>
+        <w:t>👉 Abrir el repositorio en GitHub: github.com/leanmasterpymes/gestion_ruta</w:t>
       </w:r>
     </w:p>
     <w:p>

</xml_diff>

<commit_message>
Renumera figuras del artículo según orden de aparición y agrega número al aviso del DOCX
Las cinco figuras que se pegan en LinkedIn ahora llevan prefijo 01_ a 05_
en su nombre de archivo y el aviso del DOCX las identifica por número
("INSERTAR IMAGEN 01" en lugar del genérico "INSERTAR AQUÍ"), para
facilitar la pega ordenada al editor de LinkedIn Articles.

Mapeo:
- 01_arquitectura_sistema.png  (Sección 2)
- 02_mapa_clientes_clusters.png  (Sección 3)
- 03_plan_rutas_resuelto.png  (Sección 5)
- 04_benchmark_ortools.png  (Sección 6)
- 05_antes_despues.png  (Sección 7)

Actualizadas las referencias en src/visualize.py, scripts/build_docx.py,
scripts/build_notebook.py, los dos HTML del artículo y el notebook.
</commit_message>
<xml_diff>
--- a/docs/articulo_linkedin.docx
+++ b/docs/articulo_linkedin.docx
@@ -464,7 +464,7 @@
           <w:color w:val="B05C00"/>
           <w:sz w:val="20"/>
         </w:rPr>
-        <w:t>[INSERTAR AQUÍ — TIPO: diagrama · ARCHIVO: figuras/diagramas/arquitectura_sistema.png · ALT: Pipeline del sistema con dos inputs (histórico de pedidos y disponibilidad por centro) que alimentan la predicción de demanda, el clustering de clientes, la programación dinámica, el plan de rutas coordinado y el dashboard.]</w:t>
+        <w:t>[INSERTAR IMAGEN 01 — TIPO: diagrama · ARCHIVO: figuras/diagramas/01_arquitectura_sistema.png · ALT: Pipeline del sistema con dos inputs (histórico de pedidos y disponibilidad por centro) que alimentan la predicción de demanda, el clustering de clientes, la programación dinámica, el plan de rutas coordinado y el dashboard.]</w:t>
       </w:r>
     </w:p>
     <w:p>
@@ -671,7 +671,7 @@
           <w:color w:val="B05C00"/>
           <w:sz w:val="20"/>
         </w:rPr>
-        <w:t>[INSERTAR AQUÍ — TIPO: imagen · ARCHIVO: figuras/imagenes/mapa_clientes_clusters.png · ALT: Mapa de los 50 clientes coloreados por centro de distribución asignado, con los 5 centros marcados como cuadrados.]</w:t>
+        <w:t>[INSERTAR IMAGEN 02 — TIPO: imagen · ARCHIVO: figuras/imagenes/02_mapa_clientes_clusters.png · ALT: Mapa de los 50 clientes coloreados por centro de distribución asignado, con los 5 centros marcados como cuadrados.]</w:t>
       </w:r>
     </w:p>
     <w:p>
@@ -817,7 +817,7 @@
           <w:color w:val="B05C00"/>
           <w:sz w:val="20"/>
         </w:rPr>
-        <w:t>[INSERTAR AQUÍ — TIPO: imagen · ARCHIVO: figuras/imagenes/plan_rutas_resuelto.png · ALT: Mapa con las rutas finales resueltas, líneas coloreadas saliendo de cada centro de distribución hacia sus clientes en secuencia óptima.]</w:t>
+        <w:t>[INSERTAR IMAGEN 03 — TIPO: imagen · ARCHIVO: figuras/imagenes/03_plan_rutas_resuelto.png · ALT: Mapa con las rutas finales resueltas, líneas coloreadas saliendo de cada centro de distribución hacia sus clientes en secuencia óptima.]</w:t>
       </w:r>
     </w:p>
     <w:p>
@@ -872,7 +872,7 @@
           <w:color w:val="B05C00"/>
           <w:sz w:val="20"/>
         </w:rPr>
-        <w:t>[INSERTAR AQUÍ — TIPO: tabla · ARCHIVO: figuras/tablas/benchmark_ortools.png · ALT: Tabla comparativa: ruta única 12 clientes, diferencia 0%, sistema propio 50× más rápido. Plan completo 50 clientes, diferencia +15.7% bajo restricción real de centros múltiples.]</w:t>
+        <w:t>[INSERTAR IMAGEN 04 — TIPO: tabla · ARCHIVO: figuras/tablas/04_benchmark_ortools.png · ALT: Tabla comparativa: ruta única 12 clientes, diferencia 0%, sistema propio 50× más rápido. Plan completo 50 clientes, diferencia +15.7% bajo restricción real de centros múltiples.]</w:t>
       </w:r>
     </w:p>
     <w:p>
@@ -1067,7 +1067,7 @@
           <w:color w:val="B05C00"/>
           <w:sz w:val="20"/>
         </w:rPr>
-        <w:t>[INSERTAR AQUÍ — TIPO: imagen · ARCHIVO: figuras/imagenes/antes_despues.png · ALT: Comparativa antes y después en tres barras: kilometraje total, número de rutas y costo estimado.]</w:t>
+        <w:t>[INSERTAR IMAGEN 05 — TIPO: imagen · ARCHIVO: figuras/imagenes/05_antes_despues.png · ALT: Comparativa antes y después en tres barras: kilometraje total, número de rutas y costo estimado.]</w:t>
       </w:r>
     </w:p>
     <w:p>

</xml_diff>

<commit_message>
Mejora portada con foto real y embebe imágenes inline en el DOCX
Portada (figuras/imagenes/00_hero_portada.png)
- Reemplaza el render matplotlib por una composición Pillow sobre
  imagen real provista por el usuario (camiones sobre mapa con ruta)
- Aplica gradiente lateral oscuro para legibilidad del título, banda
  de acento naranja a la izquierda, branding Leanmaster Pymes y
  créditos del autor en footer

Pull-quote Held-Karp (figuras/callouts/pull_quote_held_karp.png)
- Aumenta figsize y agrega pad_inches; reescribe quiebres de línea
  para evitar cualquier riesgo de overflow

DOCX builder
- add_aviso() ahora acepta archivo y embebe la imagen real con
  doc.add_picture(width=6.2") debajo del marcador textual. El DOCX
  pasa de 43 KB a 2.9 MB pero el usuario ve el preview de cada
  imagen junto a su [INSERTAR IMAGEN NN] sin tener que abrir los PNG
  por separado
- Nuevo helper add_aviso_con_imagen() y reemplazadas las 10 llamadas
  del documento
</commit_message>
<xml_diff>
--- a/docs/articulo_linkedin.docx
+++ b/docs/articulo_linkedin.docx
@@ -4,7 +4,7 @@
   <w:body>
     <w:p>
       <w:pPr>
-        <w:spacing w:before="200" w:after="200"/>
+        <w:spacing w:before="200" w:after="120"/>
         <w:jc w:val="center"/>
         <w:shd w:val="clear" w:color="auto" w:fill="FFF4E5"/>
       </w:pPr>
@@ -15,6 +15,46 @@
           <w:sz w:val="20"/>
         </w:rPr>
         <w:t>[INSERTAR IMAGEN 01 — TIPO: imagen de portada · ARCHIVO: figuras/imagenes/00_hero_portada.png · ALT: Portada del artículo: red tecnológica con cinco centros de distribución conectados a clientes en distintos colores, tres camiones y branding Leanmaster Pymes sobre fondo azul oscuro con grilla y partículas. Sube esta imagen como portada del Article de LinkedIn.]</w:t>
+      </w:r>
+    </w:p>
+    <w:p>
+      <w:pPr>
+        <w:spacing w:after="200"/>
+        <w:jc w:val="center"/>
+      </w:pPr>
+      <w:r>
+        <w:drawing>
+          <wp:inline xmlns:a="http://schemas.openxmlformats.org/drawingml/2006/main" xmlns:pic="http://schemas.openxmlformats.org/drawingml/2006/picture">
+            <wp:extent cx="5669280" cy="3188970"/>
+            <wp:docPr id="1" name="Picture 1"/>
+            <wp:cNvGraphicFramePr>
+              <a:graphicFrameLocks noChangeAspect="1"/>
+            </wp:cNvGraphicFramePr>
+            <a:graphic>
+              <a:graphicData uri="http://schemas.openxmlformats.org/drawingml/2006/picture">
+                <pic:pic>
+                  <pic:nvPicPr>
+                    <pic:cNvPr id="0" name="00_hero_portada.png"/>
+                    <pic:cNvPicPr/>
+                  </pic:nvPicPr>
+                  <pic:blipFill>
+                    <a:blip r:embed="rId9"/>
+                    <a:stretch>
+                      <a:fillRect/>
+                    </a:stretch>
+                  </pic:blipFill>
+                  <pic:spPr>
+                    <a:xfrm>
+                      <a:off x="0" y="0"/>
+                      <a:ext cx="5669280" cy="3188970"/>
+                    </a:xfrm>
+                    <a:prstGeom prst="rect"/>
+                  </pic:spPr>
+                </pic:pic>
+              </a:graphicData>
+            </a:graphic>
+          </wp:inline>
+        </w:drawing>
       </w:r>
     </w:p>
     <w:p>
@@ -426,7 +466,7 @@
     </w:p>
     <w:p>
       <w:pPr>
-        <w:spacing w:before="200" w:after="200"/>
+        <w:spacing w:before="200" w:after="120"/>
         <w:jc w:val="center"/>
         <w:shd w:val="clear" w:color="auto" w:fill="FFF4E5"/>
       </w:pPr>
@@ -437,6 +477,46 @@
           <w:sz w:val="20"/>
         </w:rPr>
         <w:t>[INSERTAR IMAGEN 02 — TIPO: callout · ARCHIVO: figuras/callouts/callout_repo_github.png · ALT: Caja CTA destacando el sistema de código abierto disponible en GitHub: github.com/leanmasterpymes/gestion_rutas, que aborda el problema desde la predicción de demanda hasta el plan diario coordinado.]</w:t>
+      </w:r>
+    </w:p>
+    <w:p>
+      <w:pPr>
+        <w:spacing w:after="200"/>
+        <w:jc w:val="center"/>
+      </w:pPr>
+      <w:r>
+        <w:drawing>
+          <wp:inline xmlns:a="http://schemas.openxmlformats.org/drawingml/2006/main" xmlns:pic="http://schemas.openxmlformats.org/drawingml/2006/picture">
+            <wp:extent cx="5669280" cy="1629701"/>
+            <wp:docPr id="2" name="Picture 2"/>
+            <wp:cNvGraphicFramePr>
+              <a:graphicFrameLocks noChangeAspect="1"/>
+            </wp:cNvGraphicFramePr>
+            <a:graphic>
+              <a:graphicData uri="http://schemas.openxmlformats.org/drawingml/2006/picture">
+                <pic:pic>
+                  <pic:nvPicPr>
+                    <pic:cNvPr id="0" name="callout_repo_github.png"/>
+                    <pic:cNvPicPr/>
+                  </pic:nvPicPr>
+                  <pic:blipFill>
+                    <a:blip r:embed="rId10"/>
+                    <a:stretch>
+                      <a:fillRect/>
+                    </a:stretch>
+                  </pic:blipFill>
+                  <pic:spPr>
+                    <a:xfrm>
+                      <a:off x="0" y="0"/>
+                      <a:ext cx="5669280" cy="1629701"/>
+                    </a:xfrm>
+                    <a:prstGeom prst="rect"/>
+                  </pic:spPr>
+                </pic:pic>
+              </a:graphicData>
+            </a:graphic>
+          </wp:inline>
+        </w:drawing>
       </w:r>
     </w:p>
     <w:p>
@@ -481,7 +561,7 @@
     </w:p>
     <w:p>
       <w:pPr>
-        <w:spacing w:before="200" w:after="200"/>
+        <w:spacing w:before="200" w:after="120"/>
         <w:jc w:val="center"/>
         <w:shd w:val="clear" w:color="auto" w:fill="FFF4E5"/>
       </w:pPr>
@@ -492,6 +572,46 @@
           <w:sz w:val="20"/>
         </w:rPr>
         <w:t>[INSERTAR IMAGEN 03 — TIPO: diagrama · ARCHIVO: figuras/diagramas/01_arquitectura_sistema.png · ALT: Pipeline del sistema con dos inputs (histórico de pedidos y disponibilidad por centro) que alimentan la predicción de demanda, el clustering de clientes, la programación dinámica, el plan de rutas coordinado y el dashboard.]</w:t>
+      </w:r>
+    </w:p>
+    <w:p>
+      <w:pPr>
+        <w:spacing w:after="200"/>
+        <w:jc w:val="center"/>
+      </w:pPr>
+      <w:r>
+        <w:drawing>
+          <wp:inline xmlns:a="http://schemas.openxmlformats.org/drawingml/2006/main" xmlns:pic="http://schemas.openxmlformats.org/drawingml/2006/picture">
+            <wp:extent cx="5669280" cy="1958695"/>
+            <wp:docPr id="3" name="Picture 3"/>
+            <wp:cNvGraphicFramePr>
+              <a:graphicFrameLocks noChangeAspect="1"/>
+            </wp:cNvGraphicFramePr>
+            <a:graphic>
+              <a:graphicData uri="http://schemas.openxmlformats.org/drawingml/2006/picture">
+                <pic:pic>
+                  <pic:nvPicPr>
+                    <pic:cNvPr id="0" name="01_arquitectura_sistema.png"/>
+                    <pic:cNvPicPr/>
+                  </pic:nvPicPr>
+                  <pic:blipFill>
+                    <a:blip r:embed="rId11"/>
+                    <a:stretch>
+                      <a:fillRect/>
+                    </a:stretch>
+                  </pic:blipFill>
+                  <pic:spPr>
+                    <a:xfrm>
+                      <a:off x="0" y="0"/>
+                      <a:ext cx="5669280" cy="1958695"/>
+                    </a:xfrm>
+                    <a:prstGeom prst="rect"/>
+                  </pic:spPr>
+                </pic:pic>
+              </a:graphicData>
+            </a:graphic>
+          </wp:inline>
+        </w:drawing>
       </w:r>
     </w:p>
     <w:p>
@@ -688,7 +808,7 @@
     </w:p>
     <w:p>
       <w:pPr>
-        <w:spacing w:before="200" w:after="200"/>
+        <w:spacing w:before="200" w:after="120"/>
         <w:jc w:val="center"/>
         <w:shd w:val="clear" w:color="auto" w:fill="FFF4E5"/>
       </w:pPr>
@@ -703,7 +823,47 @@
     </w:p>
     <w:p>
       <w:pPr>
-        <w:spacing w:before="200" w:after="200"/>
+        <w:spacing w:after="200"/>
+        <w:jc w:val="center"/>
+      </w:pPr>
+      <w:r>
+        <w:drawing>
+          <wp:inline xmlns:a="http://schemas.openxmlformats.org/drawingml/2006/main" xmlns:pic="http://schemas.openxmlformats.org/drawingml/2006/picture">
+            <wp:extent cx="5669280" cy="1514738"/>
+            <wp:docPr id="4" name="Picture 4"/>
+            <wp:cNvGraphicFramePr>
+              <a:graphicFrameLocks noChangeAspect="1"/>
+            </wp:cNvGraphicFramePr>
+            <a:graphic>
+              <a:graphicData uri="http://schemas.openxmlformats.org/drawingml/2006/picture">
+                <pic:pic>
+                  <pic:nvPicPr>
+                    <pic:cNvPr id="0" name="metric_grid_kpi.png"/>
+                    <pic:cNvPicPr/>
+                  </pic:nvPicPr>
+                  <pic:blipFill>
+                    <a:blip r:embed="rId12"/>
+                    <a:stretch>
+                      <a:fillRect/>
+                    </a:stretch>
+                  </pic:blipFill>
+                  <pic:spPr>
+                    <a:xfrm>
+                      <a:off x="0" y="0"/>
+                      <a:ext cx="5669280" cy="1514738"/>
+                    </a:xfrm>
+                    <a:prstGeom prst="rect"/>
+                  </pic:spPr>
+                </pic:pic>
+              </a:graphicData>
+            </a:graphic>
+          </wp:inline>
+        </w:drawing>
+      </w:r>
+    </w:p>
+    <w:p>
+      <w:pPr>
+        <w:spacing w:before="200" w:after="120"/>
         <w:jc w:val="center"/>
         <w:shd w:val="clear" w:color="auto" w:fill="FFF4E5"/>
       </w:pPr>
@@ -714,6 +874,46 @@
           <w:sz w:val="20"/>
         </w:rPr>
         <w:t>[INSERTAR IMAGEN 05 — TIPO: imagen · ARCHIVO: figuras/imagenes/02_mapa_clientes_clusters.png · ALT: Mapa de los 50 clientes coloreados por centro de distribución asignado, con los 5 centros marcados como cuadrados.]</w:t>
+      </w:r>
+    </w:p>
+    <w:p>
+      <w:pPr>
+        <w:spacing w:after="200"/>
+        <w:jc w:val="center"/>
+      </w:pPr>
+      <w:r>
+        <w:drawing>
+          <wp:inline xmlns:a="http://schemas.openxmlformats.org/drawingml/2006/main" xmlns:pic="http://schemas.openxmlformats.org/drawingml/2006/picture">
+            <wp:extent cx="5669280" cy="4520153"/>
+            <wp:docPr id="5" name="Picture 5"/>
+            <wp:cNvGraphicFramePr>
+              <a:graphicFrameLocks noChangeAspect="1"/>
+            </wp:cNvGraphicFramePr>
+            <a:graphic>
+              <a:graphicData uri="http://schemas.openxmlformats.org/drawingml/2006/picture">
+                <pic:pic>
+                  <pic:nvPicPr>
+                    <pic:cNvPr id="0" name="02_mapa_clientes_clusters.png"/>
+                    <pic:cNvPicPr/>
+                  </pic:nvPicPr>
+                  <pic:blipFill>
+                    <a:blip r:embed="rId13"/>
+                    <a:stretch>
+                      <a:fillRect/>
+                    </a:stretch>
+                  </pic:blipFill>
+                  <pic:spPr>
+                    <a:xfrm>
+                      <a:off x="0" y="0"/>
+                      <a:ext cx="5669280" cy="4520153"/>
+                    </a:xfrm>
+                    <a:prstGeom prst="rect"/>
+                  </pic:spPr>
+                </pic:pic>
+              </a:graphicData>
+            </a:graphic>
+          </wp:inline>
+        </w:drawing>
       </w:r>
     </w:p>
     <w:p>
@@ -758,7 +958,7 @@
     </w:p>
     <w:p>
       <w:pPr>
-        <w:spacing w:before="200" w:after="200"/>
+        <w:spacing w:before="200" w:after="120"/>
         <w:jc w:val="center"/>
         <w:shd w:val="clear" w:color="auto" w:fill="FFF4E5"/>
       </w:pPr>
@@ -769,6 +969,46 @@
           <w:sz w:val="20"/>
         </w:rPr>
         <w:t>[INSERTAR IMAGEN 06 — TIPO: callout · ARCHIVO: figuras/callouts/pull_quote_held_karp.png · ALT: Cita destacada: ¿Cuál es el camino más corto para visitar este conjunto de clientes y volver al centro de distribución? La programación dinámica responde esa pregunta sin probar todas las combinaciones posibles.]</w:t>
+      </w:r>
+    </w:p>
+    <w:p>
+      <w:pPr>
+        <w:spacing w:after="200"/>
+        <w:jc w:val="center"/>
+      </w:pPr>
+      <w:r>
+        <w:drawing>
+          <wp:inline xmlns:a="http://schemas.openxmlformats.org/drawingml/2006/main" xmlns:pic="http://schemas.openxmlformats.org/drawingml/2006/picture">
+            <wp:extent cx="5669280" cy="1759809"/>
+            <wp:docPr id="6" name="Picture 6"/>
+            <wp:cNvGraphicFramePr>
+              <a:graphicFrameLocks noChangeAspect="1"/>
+            </wp:cNvGraphicFramePr>
+            <a:graphic>
+              <a:graphicData uri="http://schemas.openxmlformats.org/drawingml/2006/picture">
+                <pic:pic>
+                  <pic:nvPicPr>
+                    <pic:cNvPr id="0" name="pull_quote_held_karp.png"/>
+                    <pic:cNvPicPr/>
+                  </pic:nvPicPr>
+                  <pic:blipFill>
+                    <a:blip r:embed="rId14"/>
+                    <a:stretch>
+                      <a:fillRect/>
+                    </a:stretch>
+                  </pic:blipFill>
+                  <pic:spPr>
+                    <a:xfrm>
+                      <a:off x="0" y="0"/>
+                      <a:ext cx="5669280" cy="1759809"/>
+                    </a:xfrm>
+                    <a:prstGeom prst="rect"/>
+                  </pic:spPr>
+                </pic:pic>
+              </a:graphicData>
+            </a:graphic>
+          </wp:inline>
+        </w:drawing>
       </w:r>
     </w:p>
     <w:p>
@@ -849,7 +1089,7 @@
     </w:p>
     <w:p>
       <w:pPr>
-        <w:spacing w:before="200" w:after="200"/>
+        <w:spacing w:before="200" w:after="120"/>
         <w:jc w:val="center"/>
         <w:shd w:val="clear" w:color="auto" w:fill="FFF4E5"/>
       </w:pPr>
@@ -860,6 +1100,46 @@
           <w:sz w:val="20"/>
         </w:rPr>
         <w:t>[INSERTAR IMAGEN 07 — TIPO: imagen · ARCHIVO: figuras/imagenes/03_plan_rutas_resuelto.png · ALT: Mapa con las rutas finales resueltas, líneas coloreadas saliendo de cada centro de distribución hacia sus clientes en secuencia óptima.]</w:t>
+      </w:r>
+    </w:p>
+    <w:p>
+      <w:pPr>
+        <w:spacing w:after="200"/>
+        <w:jc w:val="center"/>
+      </w:pPr>
+      <w:r>
+        <w:drawing>
+          <wp:inline xmlns:a="http://schemas.openxmlformats.org/drawingml/2006/main" xmlns:pic="http://schemas.openxmlformats.org/drawingml/2006/picture">
+            <wp:extent cx="5669280" cy="4523971"/>
+            <wp:docPr id="7" name="Picture 7"/>
+            <wp:cNvGraphicFramePr>
+              <a:graphicFrameLocks noChangeAspect="1"/>
+            </wp:cNvGraphicFramePr>
+            <a:graphic>
+              <a:graphicData uri="http://schemas.openxmlformats.org/drawingml/2006/picture">
+                <pic:pic>
+                  <pic:nvPicPr>
+                    <pic:cNvPr id="0" name="03_plan_rutas_resuelto.png"/>
+                    <pic:cNvPicPr/>
+                  </pic:nvPicPr>
+                  <pic:blipFill>
+                    <a:blip r:embed="rId15"/>
+                    <a:stretch>
+                      <a:fillRect/>
+                    </a:stretch>
+                  </pic:blipFill>
+                  <pic:spPr>
+                    <a:xfrm>
+                      <a:off x="0" y="0"/>
+                      <a:ext cx="5669280" cy="4523971"/>
+                    </a:xfrm>
+                    <a:prstGeom prst="rect"/>
+                  </pic:spPr>
+                </pic:pic>
+              </a:graphicData>
+            </a:graphic>
+          </wp:inline>
+        </w:drawing>
       </w:r>
     </w:p>
     <w:p>
@@ -904,7 +1184,7 @@
     </w:p>
     <w:p>
       <w:pPr>
-        <w:spacing w:before="200" w:after="200"/>
+        <w:spacing w:before="200" w:after="120"/>
         <w:jc w:val="center"/>
         <w:shd w:val="clear" w:color="auto" w:fill="FFF4E5"/>
       </w:pPr>
@@ -919,7 +1199,47 @@
     </w:p>
     <w:p>
       <w:pPr>
-        <w:spacing w:before="200" w:after="200"/>
+        <w:spacing w:after="200"/>
+        <w:jc w:val="center"/>
+      </w:pPr>
+      <w:r>
+        <w:drawing>
+          <wp:inline xmlns:a="http://schemas.openxmlformats.org/drawingml/2006/main" xmlns:pic="http://schemas.openxmlformats.org/drawingml/2006/picture">
+            <wp:extent cx="5669280" cy="1530012"/>
+            <wp:docPr id="8" name="Picture 8"/>
+            <wp:cNvGraphicFramePr>
+              <a:graphicFrameLocks noChangeAspect="1"/>
+            </wp:cNvGraphicFramePr>
+            <a:graphic>
+              <a:graphicData uri="http://schemas.openxmlformats.org/drawingml/2006/picture">
+                <pic:pic>
+                  <pic:nvPicPr>
+                    <pic:cNvPr id="0" name="04_benchmark_ortools.png"/>
+                    <pic:cNvPicPr/>
+                  </pic:nvPicPr>
+                  <pic:blipFill>
+                    <a:blip r:embed="rId16"/>
+                    <a:stretch>
+                      <a:fillRect/>
+                    </a:stretch>
+                  </pic:blipFill>
+                  <pic:spPr>
+                    <a:xfrm>
+                      <a:off x="0" y="0"/>
+                      <a:ext cx="5669280" cy="1530012"/>
+                    </a:xfrm>
+                    <a:prstGeom prst="rect"/>
+                  </pic:spPr>
+                </pic:pic>
+              </a:graphicData>
+            </a:graphic>
+          </wp:inline>
+        </w:drawing>
+      </w:r>
+    </w:p>
+    <w:p>
+      <w:pPr>
+        <w:spacing w:before="200" w:after="120"/>
         <w:jc w:val="center"/>
         <w:shd w:val="clear" w:color="auto" w:fill="FFF4E5"/>
       </w:pPr>
@@ -930,6 +1250,46 @@
           <w:sz w:val="20"/>
         </w:rPr>
         <w:t>[INSERTAR IMAGEN 09 — TIPO: callout · ARCHIVO: figuras/callouts/callout_info_benchmark.png · ALT: Lectura del benchmark: en el caso pequeño el sistema propio iguala al estándar industrial 50 veces más rápido. En el caso grande OR-Tools logra menos kilómetros porque consolida la flota en un depósito ficticio, esquema irrealizable en la operación real. Bajo la misma restricción operativa el motor propio queda dentro de un margen razonable del óptimo.]</w:t>
+      </w:r>
+    </w:p>
+    <w:p>
+      <w:pPr>
+        <w:spacing w:after="200"/>
+        <w:jc w:val="center"/>
+      </w:pPr>
+      <w:r>
+        <w:drawing>
+          <wp:inline xmlns:a="http://schemas.openxmlformats.org/drawingml/2006/main" xmlns:pic="http://schemas.openxmlformats.org/drawingml/2006/picture">
+            <wp:extent cx="5669280" cy="1928769"/>
+            <wp:docPr id="9" name="Picture 9"/>
+            <wp:cNvGraphicFramePr>
+              <a:graphicFrameLocks noChangeAspect="1"/>
+            </wp:cNvGraphicFramePr>
+            <a:graphic>
+              <a:graphicData uri="http://schemas.openxmlformats.org/drawingml/2006/picture">
+                <pic:pic>
+                  <pic:nvPicPr>
+                    <pic:cNvPr id="0" name="callout_info_benchmark.png"/>
+                    <pic:cNvPicPr/>
+                  </pic:nvPicPr>
+                  <pic:blipFill>
+                    <a:blip r:embed="rId17"/>
+                    <a:stretch>
+                      <a:fillRect/>
+                    </a:stretch>
+                  </pic:blipFill>
+                  <pic:spPr>
+                    <a:xfrm>
+                      <a:off x="0" y="0"/>
+                      <a:ext cx="5669280" cy="1928769"/>
+                    </a:xfrm>
+                    <a:prstGeom prst="rect"/>
+                  </pic:spPr>
+                </pic:pic>
+              </a:graphicData>
+            </a:graphic>
+          </wp:inline>
+        </w:drawing>
       </w:r>
     </w:p>
     <w:p>
@@ -1099,7 +1459,7 @@
     </w:p>
     <w:p>
       <w:pPr>
-        <w:spacing w:before="200" w:after="200"/>
+        <w:spacing w:before="200" w:after="120"/>
         <w:jc w:val="center"/>
         <w:shd w:val="clear" w:color="auto" w:fill="FFF4E5"/>
       </w:pPr>
@@ -1110,6 +1470,46 @@
           <w:sz w:val="20"/>
         </w:rPr>
         <w:t>[INSERTAR IMAGEN 10 — TIPO: imagen · ARCHIVO: figuras/imagenes/05_antes_despues.png · ALT: Comparativa antes y después en tres barras: kilometraje total, número de rutas y costo estimado.]</w:t>
+      </w:r>
+    </w:p>
+    <w:p>
+      <w:pPr>
+        <w:spacing w:after="200"/>
+        <w:jc w:val="center"/>
+      </w:pPr>
+      <w:r>
+        <w:drawing>
+          <wp:inline xmlns:a="http://schemas.openxmlformats.org/drawingml/2006/main" xmlns:pic="http://schemas.openxmlformats.org/drawingml/2006/picture">
+            <wp:extent cx="5669280" cy="2039183"/>
+            <wp:docPr id="10" name="Picture 10"/>
+            <wp:cNvGraphicFramePr>
+              <a:graphicFrameLocks noChangeAspect="1"/>
+            </wp:cNvGraphicFramePr>
+            <a:graphic>
+              <a:graphicData uri="http://schemas.openxmlformats.org/drawingml/2006/picture">
+                <pic:pic>
+                  <pic:nvPicPr>
+                    <pic:cNvPr id="0" name="05_antes_despues.png"/>
+                    <pic:cNvPicPr/>
+                  </pic:nvPicPr>
+                  <pic:blipFill>
+                    <a:blip r:embed="rId18"/>
+                    <a:stretch>
+                      <a:fillRect/>
+                    </a:stretch>
+                  </pic:blipFill>
+                  <pic:spPr>
+                    <a:xfrm>
+                      <a:off x="0" y="0"/>
+                      <a:ext cx="5669280" cy="2039183"/>
+                    </a:xfrm>
+                    <a:prstGeom prst="rect"/>
+                  </pic:spPr>
+                </pic:pic>
+              </a:graphicData>
+            </a:graphic>
+          </wp:inline>
+        </w:drawing>
       </w:r>
     </w:p>
     <w:p>

</xml_diff>